<commit_message>
Add two-person team to Word proposal
Introduce a Project Team section: Gary Shannon as Lead Architect plus a
dedicated support engineer assisting daily with engineering, product and
testing. Fixed price unchanged at $20,000; renumber sections.

Co-Authored-By: Claude Opus 4.8 <noreply@anthropic.com>
Claude-Session: https://claude.ai/code/session_011bUwMcRtgNUyipe9jLvq3o
</commit_message>
<xml_diff>
--- a/Gather_Proposal.docx
+++ b/Gather_Proposal.docx
@@ -119,7 +119,49 @@
                 <w:color w:val="000000"/>
                 <w:sz w:val="21"/>
               </w:rPr>
-              <w:t>Gary Shannon</w:t>
+              <w:t>Gary Shannon (Lead Architect)</w:t>
+            </w:r>
+          </w:p>
+        </w:tc>
+      </w:tr>
+      <w:tr>
+        <w:tc>
+          <w:tcPr>
+            <w:tcW w:type="dxa" w:w="2880"/>
+          </w:tcPr>
+          <w:p>
+            <w:pPr>
+              <w:spacing w:after="40" w:before="40"/>
+            </w:pPr>
+            <w:r/>
+            <w:r>
+              <w:rPr>
+                <w:rFonts w:ascii="Calibri" w:hAnsi="Calibri"/>
+                <w:b w:val="0"/>
+                <w:color w:val="000000"/>
+                <w:sz w:val="21"/>
+              </w:rPr>
+              <w:t>Project team</w:t>
+            </w:r>
+          </w:p>
+        </w:tc>
+        <w:tc>
+          <w:tcPr>
+            <w:tcW w:type="dxa" w:w="6480"/>
+          </w:tcPr>
+          <w:p>
+            <w:pPr>
+              <w:spacing w:after="40" w:before="40"/>
+            </w:pPr>
+            <w:r/>
+            <w:r>
+              <w:rPr>
+                <w:rFonts w:ascii="Calibri" w:hAnsi="Calibri"/>
+                <w:b w:val="0"/>
+                <w:color w:val="000000"/>
+                <w:sz w:val="21"/>
+              </w:rPr>
+              <w:t>Lead Architect plus a dedicated support engineer</w:t>
             </w:r>
           </w:p>
         </w:tc>
@@ -411,7 +453,7 @@
           <w:color w:val="000000"/>
           <w:sz w:val="22"/>
         </w:rPr>
-        <w:t>This document sets out the scope, technical approach, delivery schedule and cost to build a launch-ready version of the application for a single city on iOS. The work is delivered by a single developer using AI-assisted development tooling (Claude Code), which is what makes the timeline and cost below achievable.</w:t>
+        <w:t>This document sets out the scope, technical approach, delivery schedule and cost to build a launch-ready version of the application for a single city on iOS. The work is delivered by a small dedicated team, led by Gary Shannon as Lead Architect and supported by a second engineer working on the project daily, using AI-assisted development tooling (Claude Code). This team structure is what makes the timeline and cost below achievable.</w:t>
       </w:r>
     </w:p>
     <w:p>
@@ -447,7 +489,7 @@
           <w:color w:val="000000"/>
           <w:sz w:val="22"/>
         </w:rPr>
-        <w:t>AI-assisted development has materially changed the speed at which a single developer can deliver software. It has also made precise date estimates less reliable, because each week of work now moves faster and with more variability than under traditional methods.</w:t>
+        <w:t>AI-assisted development has materially changed the speed at which a small team can deliver software. It has also made precise date estimates less reliable, because each week of work now moves faster and with more variability than under traditional methods.</w:t>
       </w:r>
     </w:p>
     <w:p>
@@ -469,7 +511,143 @@
         <w:pStyle w:val="Heading1"/>
       </w:pPr>
       <w:r>
-        <w:t>3. Project Overview</w:t>
+        <w:t>3. Project Team</w:t>
+      </w:r>
+    </w:p>
+    <w:p>
+      <w:pPr>
+        <w:spacing w:after="120"/>
+      </w:pPr>
+      <w:r>
+        <w:rPr>
+          <w:b w:val="0"/>
+          <w:i w:val="0"/>
+          <w:color w:val="000000"/>
+          <w:sz w:val="22"/>
+        </w:rPr>
+        <w:t>The project is delivered by a dedicated two-person team.</w:t>
+      </w:r>
+    </w:p>
+    <w:p>
+      <w:pPr>
+        <w:spacing w:after="40"/>
+      </w:pPr>
+      <w:r>
+        <w:rPr>
+          <w:b/>
+          <w:i w:val="0"/>
+          <w:color w:val="000000"/>
+          <w:sz w:val="22"/>
+        </w:rPr>
+        <w:t>Lead Architect - Gary Shannon.</w:t>
+      </w:r>
+    </w:p>
+    <w:p>
+      <w:pPr>
+        <w:pStyle w:val="ListBullet"/>
+        <w:spacing w:after="60"/>
+      </w:pPr>
+      <w:r>
+        <w:rPr>
+          <w:sz w:val="22"/>
+        </w:rPr>
+        <w:t>Owns the technical design, system architecture and key engineering decisions.</w:t>
+      </w:r>
+    </w:p>
+    <w:p>
+      <w:pPr>
+        <w:pStyle w:val="ListBullet"/>
+        <w:spacing w:after="60"/>
+      </w:pPr>
+      <w:r>
+        <w:rPr>
+          <w:sz w:val="22"/>
+        </w:rPr>
+        <w:t>Leads the payments, data model and integration work, and overall delivery.</w:t>
+      </w:r>
+    </w:p>
+    <w:p>
+      <w:pPr>
+        <w:pStyle w:val="ListBullet"/>
+        <w:spacing w:after="60"/>
+      </w:pPr>
+      <w:r>
+        <w:rPr>
+          <w:sz w:val="22"/>
+        </w:rPr>
+        <w:t>Primary point of contact and accountable for quality and timeline.</w:t>
+      </w:r>
+    </w:p>
+    <w:p>
+      <w:pPr>
+        <w:spacing w:after="40"/>
+      </w:pPr>
+      <w:r>
+        <w:rPr>
+          <w:b/>
+          <w:i w:val="0"/>
+          <w:color w:val="000000"/>
+          <w:sz w:val="22"/>
+        </w:rPr>
+        <w:t>Support Engineer.</w:t>
+      </w:r>
+    </w:p>
+    <w:p>
+      <w:pPr>
+        <w:pStyle w:val="ListBullet"/>
+        <w:spacing w:after="60"/>
+      </w:pPr>
+      <w:r>
+        <w:rPr>
+          <w:sz w:val="22"/>
+        </w:rPr>
+        <w:t>A second resource assigned to the project and working on it daily.</w:t>
+      </w:r>
+    </w:p>
+    <w:p>
+      <w:pPr>
+        <w:pStyle w:val="ListBullet"/>
+        <w:spacing w:after="60"/>
+      </w:pPr>
+      <w:r>
+        <w:rPr>
+          <w:sz w:val="22"/>
+        </w:rPr>
+        <w:t>Assists with day-to-day engineering tasks, product work, testing and delivery support.</w:t>
+      </w:r>
+    </w:p>
+    <w:p>
+      <w:pPr>
+        <w:pStyle w:val="ListBullet"/>
+        <w:spacing w:after="60"/>
+      </w:pPr>
+      <w:r>
+        <w:rPr>
+          <w:sz w:val="22"/>
+        </w:rPr>
+        <w:t>Provides continuity and a second set of eyes throughout the build.</w:t>
+      </w:r>
+    </w:p>
+    <w:p>
+      <w:pPr>
+        <w:spacing w:after="120"/>
+      </w:pPr>
+      <w:r>
+        <w:rPr>
+          <w:b w:val="0"/>
+          <w:i/>
+          <w:color w:val="555555"/>
+          <w:sz w:val="21"/>
+        </w:rPr>
+        <w:t>Both roles are covered by the project day rate of $500 per day. The team structure increases delivery capacity and provides review and continuity at no change to the fixed price quoted in this proposal.</w:t>
+      </w:r>
+    </w:p>
+    <w:p>
+      <w:pPr>
+        <w:pStyle w:val="Heading1"/>
+      </w:pPr>
+      <w:r>
+        <w:t>4. Project Overview</w:t>
       </w:r>
     </w:p>
     <w:p>
@@ -770,7 +948,7 @@
         <w:pStyle w:val="Heading1"/>
       </w:pPr>
       <w:r>
-        <w:t>4. Scope of Work</w:t>
+        <w:t>5. Scope of Work</w:t>
       </w:r>
     </w:p>
     <w:p>
@@ -792,7 +970,7 @@
         <w:pStyle w:val="Heading2"/>
       </w:pPr>
       <w:r>
-        <w:t>4.1 Onboarding</w:t>
+        <w:t>5.1 Onboarding</w:t>
       </w:r>
     </w:p>
     <w:p>
@@ -848,7 +1026,7 @@
         <w:pStyle w:val="Heading2"/>
       </w:pPr>
       <w:r>
-        <w:t>4.2 The Weekly Loop</w:t>
+        <w:t>5.2 The Weekly Loop</w:t>
       </w:r>
     </w:p>
     <w:p>
@@ -904,7 +1082,7 @@
         <w:pStyle w:val="Heading2"/>
       </w:pPr>
       <w:r>
-        <w:t>4.3 Continuity</w:t>
+        <w:t>5.3 Continuity</w:t>
       </w:r>
     </w:p>
     <w:p>
@@ -960,7 +1138,7 @@
         <w:pStyle w:val="Heading2"/>
       </w:pPr>
       <w:r>
-        <w:t>4.4 Membership and Profile</w:t>
+        <w:t>5.4 Membership and Profile</w:t>
       </w:r>
     </w:p>
     <w:p>
@@ -1004,7 +1182,7 @@
         <w:pStyle w:val="Heading2"/>
       </w:pPr>
       <w:r>
-        <w:t>4.5 Operations</w:t>
+        <w:t>5.5 Operations</w:t>
       </w:r>
     </w:p>
     <w:p>
@@ -1026,7 +1204,7 @@
         <w:pStyle w:val="Heading1"/>
       </w:pPr>
       <w:r>
-        <w:t>5. Technical Approach</w:t>
+        <w:t>6. Technical Approach</w:t>
       </w:r>
     </w:p>
     <w:p>
@@ -1561,7 +1739,7 @@
         <w:pStyle w:val="Heading1"/>
       </w:pPr>
       <w:r>
-        <w:t>6. Delivery Schedule</w:t>
+        <w:t>7. Delivery Schedule</w:t>
       </w:r>
     </w:p>
     <w:p>
@@ -2158,7 +2336,7 @@
         <w:pStyle w:val="Heading1"/>
       </w:pPr>
       <w:r>
-        <w:t>7. Cost Summary</w:t>
+        <w:t>8. Cost Summary</w:t>
       </w:r>
     </w:p>
     <w:tbl>
@@ -2383,7 +2561,7 @@
         <w:pStyle w:val="Heading1"/>
       </w:pPr>
       <w:r>
-        <w:t>8. Payment Schedule</w:t>
+        <w:t>9. Payment Schedule</w:t>
       </w:r>
     </w:p>
     <w:tbl>
@@ -2732,7 +2910,7 @@
         <w:pStyle w:val="Heading1"/>
       </w:pPr>
       <w:r>
-        <w:t>9. Decisions Required Before Work Begins</w:t>
+        <w:t>10. Decisions Required Before Work Begins</w:t>
       </w:r>
     </w:p>
     <w:p>
@@ -2814,7 +2992,7 @@
         <w:pStyle w:val="Heading1"/>
       </w:pPr>
       <w:r>
-        <w:t>10. Fast-Follows After Launch</w:t>
+        <w:t>11. Fast-Follows After Launch</w:t>
       </w:r>
     </w:p>
     <w:p>
@@ -2960,7 +3138,7 @@
         <w:pStyle w:val="Heading1"/>
       </w:pPr>
       <w:r>
-        <w:t>11. Assumptions</w:t>
+        <w:t>12. Assumptions</w:t>
       </w:r>
     </w:p>
     <w:p>
@@ -3040,7 +3218,7 @@
         <w:pStyle w:val="Heading1"/>
       </w:pPr>
       <w:r>
-        <w:t>12. Costs Not Included in This Quote</w:t>
+        <w:t>13. Costs Not Included in This Quote</w:t>
       </w:r>
     </w:p>
     <w:p>
@@ -3108,7 +3286,7 @@
         <w:pStyle w:val="Heading1"/>
       </w:pPr>
       <w:r>
-        <w:t>13. Next Steps</w:t>
+        <w:t>14. Next Steps</w:t>
       </w:r>
     </w:p>
     <w:p>

</xml_diff>

<commit_message>
Switch payment schedule to weekly invoicing
Replace milestone payments with eight weekly invoices of $2,500
(five days at $500/day), total unchanged at $20,000.

Co-Authored-By: Claude Opus 4.8 <noreply@anthropic.com>
Claude-Session: https://claude.ai/code/session_011bUwMcRtgNUyipe9jLvq3o
</commit_message>
<xml_diff>
--- a/Gather_Proposal.docx
+++ b/Gather_Proposal.docx
@@ -2564,6 +2564,20 @@
         <w:t>9. Payment Schedule</w:t>
       </w:r>
     </w:p>
+    <w:p>
+      <w:pPr>
+        <w:spacing w:after="120"/>
+      </w:pPr>
+      <w:r>
+        <w:rPr>
+          <w:b w:val="0"/>
+          <w:i w:val="0"/>
+          <w:color w:val="000000"/>
+          <w:sz w:val="22"/>
+        </w:rPr>
+        <w:t>The engagement is invoiced weekly. Each weekly invoice is $2,500 (five working days at $500 per day), for eight weeks.</w:t>
+      </w:r>
+    </w:p>
     <w:tbl>
       <w:tblPr>
         <w:tblStyle w:val="TableGrid"/>
@@ -2579,7 +2593,7 @@
       <w:tr>
         <w:tc>
           <w:tcPr>
-            <w:tcW w:type="dxa" w:w="5040"/>
+            <w:tcW w:type="dxa" w:w="2880"/>
             <w:shd w:val="clear" w:color="auto" w:fill="D9D9D9"/>
           </w:tcPr>
           <w:p>
@@ -2594,13 +2608,13 @@
                 <w:color w:val="000000"/>
                 <w:sz w:val="21"/>
               </w:rPr>
-              <w:t>Milestone</w:t>
+              <w:t>Invoice</w:t>
             </w:r>
           </w:p>
         </w:tc>
         <w:tc>
           <w:tcPr>
-            <w:tcW w:type="dxa" w:w="2160"/>
+            <w:tcW w:type="dxa" w:w="4320"/>
             <w:shd w:val="clear" w:color="auto" w:fill="D9D9D9"/>
           </w:tcPr>
           <w:p>
@@ -2615,7 +2629,7 @@
                 <w:color w:val="000000"/>
                 <w:sz w:val="21"/>
               </w:rPr>
-              <w:t>Percentage</w:t>
+              <w:t>Timing</w:t>
             </w:r>
           </w:p>
         </w:tc>
@@ -2644,7 +2658,7 @@
       <w:tr>
         <w:tc>
           <w:tcPr>
-            <w:tcW w:type="dxa" w:w="5040"/>
+            <w:tcW w:type="dxa" w:w="2880"/>
           </w:tcPr>
           <w:p>
             <w:pPr>
@@ -2658,7 +2672,27 @@
                 <w:color w:val="000000"/>
                 <w:sz w:val="21"/>
               </w:rPr>
-              <w:t>On commencement</w:t>
+              <w:t>Week 1</w:t>
+            </w:r>
+          </w:p>
+        </w:tc>
+        <w:tc>
+          <w:tcPr>
+            <w:tcW w:type="dxa" w:w="4320"/>
+          </w:tcPr>
+          <w:p>
+            <w:pPr>
+              <w:spacing w:after="40" w:before="40"/>
+            </w:pPr>
+            <w:r/>
+            <w:r>
+              <w:rPr>
+                <w:rFonts w:ascii="Calibri" w:hAnsi="Calibri"/>
+                <w:b w:val="0"/>
+                <w:color w:val="000000"/>
+                <w:sz w:val="21"/>
+              </w:rPr>
+              <w:t>End of Week 1</w:t>
             </w:r>
           </w:p>
         </w:tc>
@@ -2678,7 +2712,49 @@
                 <w:color w:val="000000"/>
                 <w:sz w:val="21"/>
               </w:rPr>
-              <w:t>30%</w:t>
+              <w:t>$2,500</w:t>
+            </w:r>
+          </w:p>
+        </w:tc>
+      </w:tr>
+      <w:tr>
+        <w:tc>
+          <w:tcPr>
+            <w:tcW w:type="dxa" w:w="2880"/>
+          </w:tcPr>
+          <w:p>
+            <w:pPr>
+              <w:spacing w:after="40" w:before="40"/>
+            </w:pPr>
+            <w:r/>
+            <w:r>
+              <w:rPr>
+                <w:rFonts w:ascii="Calibri" w:hAnsi="Calibri"/>
+                <w:b w:val="0"/>
+                <w:color w:val="000000"/>
+                <w:sz w:val="21"/>
+              </w:rPr>
+              <w:t>Week 2</w:t>
+            </w:r>
+          </w:p>
+        </w:tc>
+        <w:tc>
+          <w:tcPr>
+            <w:tcW w:type="dxa" w:w="4320"/>
+          </w:tcPr>
+          <w:p>
+            <w:pPr>
+              <w:spacing w:after="40" w:before="40"/>
+            </w:pPr>
+            <w:r/>
+            <w:r>
+              <w:rPr>
+                <w:rFonts w:ascii="Calibri" w:hAnsi="Calibri"/>
+                <w:b w:val="0"/>
+                <w:color w:val="000000"/>
+                <w:sz w:val="21"/>
+              </w:rPr>
+              <w:t>End of Week 2</w:t>
             </w:r>
           </w:p>
         </w:tc>
@@ -2698,7 +2774,7 @@
                 <w:color w:val="000000"/>
                 <w:sz w:val="21"/>
               </w:rPr>
-              <w:t>$6,000</w:t>
+              <w:t>$2,500</w:t>
             </w:r>
           </w:p>
         </w:tc>
@@ -2706,7 +2782,7 @@
       <w:tr>
         <w:tc>
           <w:tcPr>
-            <w:tcW w:type="dxa" w:w="5040"/>
+            <w:tcW w:type="dxa" w:w="2880"/>
           </w:tcPr>
           <w:p>
             <w:pPr>
@@ -2720,7 +2796,27 @@
                 <w:color w:val="000000"/>
                 <w:sz w:val="21"/>
               </w:rPr>
-              <w:t>On completion of Week 5 (feature complete)</w:t>
+              <w:t>Week 3</w:t>
+            </w:r>
+          </w:p>
+        </w:tc>
+        <w:tc>
+          <w:tcPr>
+            <w:tcW w:type="dxa" w:w="4320"/>
+          </w:tcPr>
+          <w:p>
+            <w:pPr>
+              <w:spacing w:after="40" w:before="40"/>
+            </w:pPr>
+            <w:r/>
+            <w:r>
+              <w:rPr>
+                <w:rFonts w:ascii="Calibri" w:hAnsi="Calibri"/>
+                <w:b w:val="0"/>
+                <w:color w:val="000000"/>
+                <w:sz w:val="21"/>
+              </w:rPr>
+              <w:t>End of Week 3</w:t>
             </w:r>
           </w:p>
         </w:tc>
@@ -2740,7 +2836,49 @@
                 <w:color w:val="000000"/>
                 <w:sz w:val="21"/>
               </w:rPr>
-              <w:t>40%</w:t>
+              <w:t>$2,500</w:t>
+            </w:r>
+          </w:p>
+        </w:tc>
+      </w:tr>
+      <w:tr>
+        <w:tc>
+          <w:tcPr>
+            <w:tcW w:type="dxa" w:w="2880"/>
+          </w:tcPr>
+          <w:p>
+            <w:pPr>
+              <w:spacing w:after="40" w:before="40"/>
+            </w:pPr>
+            <w:r/>
+            <w:r>
+              <w:rPr>
+                <w:rFonts w:ascii="Calibri" w:hAnsi="Calibri"/>
+                <w:b w:val="0"/>
+                <w:color w:val="000000"/>
+                <w:sz w:val="21"/>
+              </w:rPr>
+              <w:t>Week 4</w:t>
+            </w:r>
+          </w:p>
+        </w:tc>
+        <w:tc>
+          <w:tcPr>
+            <w:tcW w:type="dxa" w:w="4320"/>
+          </w:tcPr>
+          <w:p>
+            <w:pPr>
+              <w:spacing w:after="40" w:before="40"/>
+            </w:pPr>
+            <w:r/>
+            <w:r>
+              <w:rPr>
+                <w:rFonts w:ascii="Calibri" w:hAnsi="Calibri"/>
+                <w:b w:val="0"/>
+                <w:color w:val="000000"/>
+                <w:sz w:val="21"/>
+              </w:rPr>
+              <w:t>End of Week 4</w:t>
             </w:r>
           </w:p>
         </w:tc>
@@ -2760,7 +2898,7 @@
                 <w:color w:val="000000"/>
                 <w:sz w:val="21"/>
               </w:rPr>
-              <w:t>$8,000</w:t>
+              <w:t>$2,500</w:t>
             </w:r>
           </w:p>
         </w:tc>
@@ -2768,7 +2906,7 @@
       <w:tr>
         <w:tc>
           <w:tcPr>
-            <w:tcW w:type="dxa" w:w="5040"/>
+            <w:tcW w:type="dxa" w:w="2880"/>
           </w:tcPr>
           <w:p>
             <w:pPr>
@@ -2782,7 +2920,27 @@
                 <w:color w:val="000000"/>
                 <w:sz w:val="21"/>
               </w:rPr>
-              <w:t>On app store submission</w:t>
+              <w:t>Week 5</w:t>
+            </w:r>
+          </w:p>
+        </w:tc>
+        <w:tc>
+          <w:tcPr>
+            <w:tcW w:type="dxa" w:w="4320"/>
+          </w:tcPr>
+          <w:p>
+            <w:pPr>
+              <w:spacing w:after="40" w:before="40"/>
+            </w:pPr>
+            <w:r/>
+            <w:r>
+              <w:rPr>
+                <w:rFonts w:ascii="Calibri" w:hAnsi="Calibri"/>
+                <w:b w:val="0"/>
+                <w:color w:val="000000"/>
+                <w:sz w:val="21"/>
+              </w:rPr>
+              <w:t>End of Week 5</w:t>
             </w:r>
           </w:p>
         </w:tc>
@@ -2802,7 +2960,49 @@
                 <w:color w:val="000000"/>
                 <w:sz w:val="21"/>
               </w:rPr>
-              <w:t>30%</w:t>
+              <w:t>$2,500</w:t>
+            </w:r>
+          </w:p>
+        </w:tc>
+      </w:tr>
+      <w:tr>
+        <w:tc>
+          <w:tcPr>
+            <w:tcW w:type="dxa" w:w="2880"/>
+          </w:tcPr>
+          <w:p>
+            <w:pPr>
+              <w:spacing w:after="40" w:before="40"/>
+            </w:pPr>
+            <w:r/>
+            <w:r>
+              <w:rPr>
+                <w:rFonts w:ascii="Calibri" w:hAnsi="Calibri"/>
+                <w:b w:val="0"/>
+                <w:color w:val="000000"/>
+                <w:sz w:val="21"/>
+              </w:rPr>
+              <w:t>Week 6</w:t>
+            </w:r>
+          </w:p>
+        </w:tc>
+        <w:tc>
+          <w:tcPr>
+            <w:tcW w:type="dxa" w:w="4320"/>
+          </w:tcPr>
+          <w:p>
+            <w:pPr>
+              <w:spacing w:after="40" w:before="40"/>
+            </w:pPr>
+            <w:r/>
+            <w:r>
+              <w:rPr>
+                <w:rFonts w:ascii="Calibri" w:hAnsi="Calibri"/>
+                <w:b w:val="0"/>
+                <w:color w:val="000000"/>
+                <w:sz w:val="21"/>
+              </w:rPr>
+              <w:t>End of Week 6</w:t>
             </w:r>
           </w:p>
         </w:tc>
@@ -2822,7 +3022,7 @@
                 <w:color w:val="000000"/>
                 <w:sz w:val="21"/>
               </w:rPr>
-              <w:t>$6,000</w:t>
+              <w:t>$2,500</w:t>
             </w:r>
           </w:p>
         </w:tc>
@@ -2830,7 +3030,131 @@
       <w:tr>
         <w:tc>
           <w:tcPr>
-            <w:tcW w:type="dxa" w:w="5040"/>
+            <w:tcW w:type="dxa" w:w="2880"/>
+          </w:tcPr>
+          <w:p>
+            <w:pPr>
+              <w:spacing w:after="40" w:before="40"/>
+            </w:pPr>
+            <w:r/>
+            <w:r>
+              <w:rPr>
+                <w:rFonts w:ascii="Calibri" w:hAnsi="Calibri"/>
+                <w:b w:val="0"/>
+                <w:color w:val="000000"/>
+                <w:sz w:val="21"/>
+              </w:rPr>
+              <w:t>Week 7</w:t>
+            </w:r>
+          </w:p>
+        </w:tc>
+        <w:tc>
+          <w:tcPr>
+            <w:tcW w:type="dxa" w:w="4320"/>
+          </w:tcPr>
+          <w:p>
+            <w:pPr>
+              <w:spacing w:after="40" w:before="40"/>
+            </w:pPr>
+            <w:r/>
+            <w:r>
+              <w:rPr>
+                <w:rFonts w:ascii="Calibri" w:hAnsi="Calibri"/>
+                <w:b w:val="0"/>
+                <w:color w:val="000000"/>
+                <w:sz w:val="21"/>
+              </w:rPr>
+              <w:t>End of Week 7</w:t>
+            </w:r>
+          </w:p>
+        </w:tc>
+        <w:tc>
+          <w:tcPr>
+            <w:tcW w:type="dxa" w:w="2160"/>
+          </w:tcPr>
+          <w:p>
+            <w:pPr>
+              <w:spacing w:after="40" w:before="40"/>
+            </w:pPr>
+            <w:r/>
+            <w:r>
+              <w:rPr>
+                <w:rFonts w:ascii="Calibri" w:hAnsi="Calibri"/>
+                <w:b w:val="0"/>
+                <w:color w:val="000000"/>
+                <w:sz w:val="21"/>
+              </w:rPr>
+              <w:t>$2,500</w:t>
+            </w:r>
+          </w:p>
+        </w:tc>
+      </w:tr>
+      <w:tr>
+        <w:tc>
+          <w:tcPr>
+            <w:tcW w:type="dxa" w:w="2880"/>
+          </w:tcPr>
+          <w:p>
+            <w:pPr>
+              <w:spacing w:after="40" w:before="40"/>
+            </w:pPr>
+            <w:r/>
+            <w:r>
+              <w:rPr>
+                <w:rFonts w:ascii="Calibri" w:hAnsi="Calibri"/>
+                <w:b w:val="0"/>
+                <w:color w:val="000000"/>
+                <w:sz w:val="21"/>
+              </w:rPr>
+              <w:t>Week 8</w:t>
+            </w:r>
+          </w:p>
+        </w:tc>
+        <w:tc>
+          <w:tcPr>
+            <w:tcW w:type="dxa" w:w="4320"/>
+          </w:tcPr>
+          <w:p>
+            <w:pPr>
+              <w:spacing w:after="40" w:before="40"/>
+            </w:pPr>
+            <w:r/>
+            <w:r>
+              <w:rPr>
+                <w:rFonts w:ascii="Calibri" w:hAnsi="Calibri"/>
+                <w:b w:val="0"/>
+                <w:color w:val="000000"/>
+                <w:sz w:val="21"/>
+              </w:rPr>
+              <w:t>End of Week 8</w:t>
+            </w:r>
+          </w:p>
+        </w:tc>
+        <w:tc>
+          <w:tcPr>
+            <w:tcW w:type="dxa" w:w="2160"/>
+          </w:tcPr>
+          <w:p>
+            <w:pPr>
+              <w:spacing w:after="40" w:before="40"/>
+            </w:pPr>
+            <w:r/>
+            <w:r>
+              <w:rPr>
+                <w:rFonts w:ascii="Calibri" w:hAnsi="Calibri"/>
+                <w:b w:val="0"/>
+                <w:color w:val="000000"/>
+                <w:sz w:val="21"/>
+              </w:rPr>
+              <w:t>$2,500</w:t>
+            </w:r>
+          </w:p>
+        </w:tc>
+      </w:tr>
+      <w:tr>
+        <w:tc>
+          <w:tcPr>
+            <w:tcW w:type="dxa" w:w="2880"/>
           </w:tcPr>
           <w:p>
             <w:pPr>
@@ -2850,7 +3174,7 @@
         </w:tc>
         <w:tc>
           <w:tcPr>
-            <w:tcW w:type="dxa" w:w="2160"/>
+            <w:tcW w:type="dxa" w:w="4320"/>
           </w:tcPr>
           <w:p>
             <w:pPr>
@@ -2864,7 +3188,7 @@
                 <w:color w:val="000000"/>
                 <w:sz w:val="21"/>
               </w:rPr>
-              <w:t>100%</w:t>
+              <w:t>8 weekly invoices</w:t>
             </w:r>
           </w:p>
         </w:tc>
@@ -2902,7 +3226,7 @@
           <w:color w:val="555555"/>
           <w:sz w:val="21"/>
         </w:rPr>
-        <w:t>Invoices are issued at each milestone with payment due within 7 days.</w:t>
+        <w:t>Each weekly invoice is issued at the end of the week, with payment due within 7 days.</w:t>
       </w:r>
     </w:p>
     <w:p>

</xml_diff>

<commit_message>
Restore $1,000/day rate ($40,000 total), offer discount on request
Revert day rate to $1,000/day; total $40,000; weekly invoices of
$5,000. Add note that a discounted rate can be discussed if budget is
a constraint.

Co-Authored-By: Claude Opus 4.8 <noreply@anthropic.com>
Claude-Session: https://claude.ai/code/session_011bUwMcRtgNUyipe9jLvq3o
</commit_message>
<xml_diff>
--- a/Gather_Proposal.docx
+++ b/Gather_Proposal.docx
@@ -371,7 +371,7 @@
                 <w:color w:val="000000"/>
                 <w:sz w:val="21"/>
               </w:rPr>
-              <w:t>$500 per day (discounted from a standard rate of $1,000 per day)</w:t>
+              <w:t>$1,000 per day (a discounted rate can be discussed if required)</w:t>
             </w:r>
           </w:p>
         </w:tc>
@@ -413,7 +413,7 @@
                 <w:color w:val="000000"/>
                 <w:sz w:val="21"/>
               </w:rPr>
-              <w:t>$20,000 (excluding GST and third-party costs)</w:t>
+              <w:t>$40,000 (excluding GST and third-party costs)</w:t>
             </w:r>
           </w:p>
         </w:tc>
@@ -467,7 +467,7 @@
           <w:color w:val="000000"/>
           <w:sz w:val="22"/>
         </w:rPr>
-        <w:t>The proposed engagement is an 8-week fixed-scope build at a discounted day rate of $500 per day (reduced from a standard rate of $1,000 per day), for a total fixed price of $20,000. Approximately 2.5 of the 8 weeks are reserved for iterative refinement, testing and launch.</w:t>
+        <w:t>The proposed engagement is an 8-week fixed-scope build at a day rate of $1,000 per day, for a total fixed price of $40,000. Approximately 2.5 of the 8 weeks are reserved for iterative refinement, testing and launch. If budget is a constraint, a discounted rate can be discussed.</w:t>
       </w:r>
     </w:p>
     <w:p>
@@ -639,7 +639,7 @@
           <w:color w:val="555555"/>
           <w:sz w:val="21"/>
         </w:rPr>
-        <w:t>Both roles are covered by the project day rate of $500 per day. The team structure increases delivery capacity and provides review and continuity at no change to the fixed price quoted in this proposal.</w:t>
+        <w:t>Both roles are covered by the project day rate of $1,000 per day. The team structure increases delivery capacity and provides review and continuity at no change to the fixed price quoted in this proposal.</w:t>
       </w:r>
     </w:p>
     <w:p>
@@ -2453,7 +2453,7 @@
                 <w:color w:val="000000"/>
                 <w:sz w:val="21"/>
               </w:rPr>
-              <w:t>40 working days at $500 per day</w:t>
+              <w:t>40 working days at $1,000 per day</w:t>
             </w:r>
           </w:p>
         </w:tc>
@@ -2473,7 +2473,7 @@
                 <w:color w:val="000000"/>
                 <w:sz w:val="21"/>
               </w:rPr>
-              <w:t>$20,000</w:t>
+              <w:t>$40,000</w:t>
             </w:r>
           </w:p>
         </w:tc>
@@ -2535,7 +2535,7 @@
                 <w:color w:val="000000"/>
                 <w:sz w:val="21"/>
               </w:rPr>
-              <w:t>$20,000</w:t>
+              <w:t>$40,000</w:t>
             </w:r>
           </w:p>
         </w:tc>
@@ -2553,7 +2553,7 @@
           <w:color w:val="555555"/>
           <w:sz w:val="21"/>
         </w:rPr>
-        <w:t>The day rate has been discounted to $500 per day from a standard rate of $1,000 per day. At the standard rate the same scope would be quoted at $40,000.</w:t>
+        <w:t>The day rate is $1,000 per day. If budget is a constraint, a discounted rate can be discussed on request.</w:t>
       </w:r>
     </w:p>
     <w:p>
@@ -2575,7 +2575,7 @@
           <w:color w:val="000000"/>
           <w:sz w:val="22"/>
         </w:rPr>
-        <w:t>The engagement is invoiced weekly. Each weekly invoice is $2,500 (five working days at $500 per day), for eight weeks.</w:t>
+        <w:t>The engagement is invoiced weekly. Each weekly invoice is $5,000 (five working days at $1,000 per day), for eight weeks.</w:t>
       </w:r>
     </w:p>
     <w:tbl>
@@ -2712,7 +2712,7 @@
                 <w:color w:val="000000"/>
                 <w:sz w:val="21"/>
               </w:rPr>
-              <w:t>$2,500</w:t>
+              <w:t>$5,000</w:t>
             </w:r>
           </w:p>
         </w:tc>
@@ -2774,7 +2774,7 @@
                 <w:color w:val="000000"/>
                 <w:sz w:val="21"/>
               </w:rPr>
-              <w:t>$2,500</w:t>
+              <w:t>$5,000</w:t>
             </w:r>
           </w:p>
         </w:tc>
@@ -2836,7 +2836,7 @@
                 <w:color w:val="000000"/>
                 <w:sz w:val="21"/>
               </w:rPr>
-              <w:t>$2,500</w:t>
+              <w:t>$5,000</w:t>
             </w:r>
           </w:p>
         </w:tc>
@@ -2898,7 +2898,7 @@
                 <w:color w:val="000000"/>
                 <w:sz w:val="21"/>
               </w:rPr>
-              <w:t>$2,500</w:t>
+              <w:t>$5,000</w:t>
             </w:r>
           </w:p>
         </w:tc>
@@ -2960,7 +2960,7 @@
                 <w:color w:val="000000"/>
                 <w:sz w:val="21"/>
               </w:rPr>
-              <w:t>$2,500</w:t>
+              <w:t>$5,000</w:t>
             </w:r>
           </w:p>
         </w:tc>
@@ -3022,7 +3022,7 @@
                 <w:color w:val="000000"/>
                 <w:sz w:val="21"/>
               </w:rPr>
-              <w:t>$2,500</w:t>
+              <w:t>$5,000</w:t>
             </w:r>
           </w:p>
         </w:tc>
@@ -3084,7 +3084,7 @@
                 <w:color w:val="000000"/>
                 <w:sz w:val="21"/>
               </w:rPr>
-              <w:t>$2,500</w:t>
+              <w:t>$5,000</w:t>
             </w:r>
           </w:p>
         </w:tc>
@@ -3146,7 +3146,7 @@
                 <w:color w:val="000000"/>
                 <w:sz w:val="21"/>
               </w:rPr>
-              <w:t>$2,500</w:t>
+              <w:t>$5,000</w:t>
             </w:r>
           </w:p>
         </w:tc>
@@ -3208,7 +3208,7 @@
                 <w:color w:val="000000"/>
                 <w:sz w:val="21"/>
               </w:rPr>
-              <w:t>$20,000</w:t>
+              <w:t>$40,000</w:t>
             </w:r>
           </w:p>
         </w:tc>
@@ -3668,7 +3668,7 @@
           <w:color w:val="555555"/>
           <w:sz w:val="18"/>
         </w:rPr>
-        <w:t>Prepared by Gary Shannon  |  10 July 2026  |  Day rate $500 per day</w:t>
+        <w:t>Prepared by Gary Shannon  |  10 July 2026  |  Day rate $1,000 per day</w:t>
       </w:r>
     </w:p>
     <w:sectPr>

</xml_diff>

<commit_message>
Add two-week trial period with go/no-go gate
New Section 8 (Engagement Structure and Trial Period): a paid two-week
trial covering Weeks 1-2, then an end-of-Week-2 review of speed, quality
and working relationship before committing to Weeks 3-8. Wire into the
executive summary, payment terms (initial commitment limited to $10,000)
and next steps; renumber later sections.

Co-Authored-By: Claude Opus 4.8 <noreply@anthropic.com>
Claude-Session: https://claude.ai/code/session_011bUwMcRtgNUyipe9jLvq3o
</commit_message>
<xml_diff>
--- a/Gather_Proposal.docx
+++ b/Gather_Proposal.docx
@@ -468,6 +468,20 @@
           <w:sz w:val="22"/>
         </w:rPr>
         <w:t>The proposed engagement is an 8-week fixed-scope build at a day rate of $1,000 per day, for a total fixed price of $40,000. Approximately 2.5 of the 8 weeks are reserved for iterative refinement, testing and launch. If budget is a constraint, a discounted rate can be discussed.</w:t>
+      </w:r>
+    </w:p>
+    <w:p>
+      <w:pPr>
+        <w:spacing w:after="120"/>
+      </w:pPr>
+      <w:r>
+        <w:rPr>
+          <w:b w:val="0"/>
+          <w:i w:val="0"/>
+          <w:color w:val="000000"/>
+          <w:sz w:val="22"/>
+        </w:rPr>
+        <w:t>The engagement is structured with a two-week trial period and a review checkpoint at the end of Week 2, so that delivery speed and output can be assessed before the remaining work is committed (see Section 8).</w:t>
       </w:r>
     </w:p>
     <w:p>
@@ -2336,7 +2350,157 @@
         <w:pStyle w:val="Heading1"/>
       </w:pPr>
       <w:r>
-        <w:t>8. Cost Summary</w:t>
+        <w:t>8. Engagement Structure and Trial Period</w:t>
+      </w:r>
+    </w:p>
+    <w:p>
+      <w:pPr>
+        <w:spacing w:after="120"/>
+      </w:pPr>
+      <w:r>
+        <w:rPr>
+          <w:b w:val="0"/>
+          <w:i w:val="0"/>
+          <w:color w:val="000000"/>
+          <w:sz w:val="22"/>
+        </w:rPr>
+        <w:t>The engagement begins with a two-week trial period, after which both parties review progress before committing to the remainder of the work.</w:t>
+      </w:r>
+    </w:p>
+    <w:p>
+      <w:pPr>
+        <w:spacing w:after="40"/>
+      </w:pPr>
+      <w:r>
+        <w:rPr>
+          <w:b/>
+          <w:i w:val="0"/>
+          <w:color w:val="000000"/>
+          <w:sz w:val="22"/>
+        </w:rPr>
+        <w:t>Trial period (Weeks 1 and 2).</w:t>
+      </w:r>
+    </w:p>
+    <w:p>
+      <w:pPr>
+        <w:pStyle w:val="ListBullet"/>
+        <w:spacing w:after="60"/>
+      </w:pPr>
+      <w:r>
+        <w:rPr>
+          <w:sz w:val="22"/>
+        </w:rPr>
+        <w:t>Runs at the standard weekly rate and covers the foundations, the design system in code, and the onboarding and waitlist experience (see the Delivery Schedule in Section 7).</w:t>
+      </w:r>
+    </w:p>
+    <w:p>
+      <w:pPr>
+        <w:pStyle w:val="ListBullet"/>
+        <w:spacing w:after="60"/>
+      </w:pPr>
+      <w:r>
+        <w:rPr>
+          <w:sz w:val="22"/>
+        </w:rPr>
+        <w:t>The purpose is to demonstrate working software, delivery speed and the working relationship.</w:t>
+      </w:r>
+    </w:p>
+    <w:p>
+      <w:pPr>
+        <w:pStyle w:val="ListBullet"/>
+        <w:spacing w:after="60"/>
+      </w:pPr>
+      <w:r>
+        <w:rPr>
+          <w:sz w:val="22"/>
+        </w:rPr>
+        <w:t>A testable build is provided at the end of each week.</w:t>
+      </w:r>
+    </w:p>
+    <w:p>
+      <w:pPr>
+        <w:spacing w:after="40"/>
+      </w:pPr>
+      <w:r>
+        <w:rPr>
+          <w:b/>
+          <w:i w:val="0"/>
+          <w:color w:val="000000"/>
+          <w:sz w:val="22"/>
+        </w:rPr>
+        <w:t>Review and go/no-go decision (end of Week 2).</w:t>
+      </w:r>
+    </w:p>
+    <w:p>
+      <w:pPr>
+        <w:spacing w:after="40"/>
+      </w:pPr>
+      <w:r>
+        <w:rPr>
+          <w:b w:val="0"/>
+          <w:i w:val="0"/>
+          <w:color w:val="000000"/>
+          <w:sz w:val="22"/>
+        </w:rPr>
+        <w:t>At the end of the trial, both parties assess:</w:t>
+      </w:r>
+    </w:p>
+    <w:p>
+      <w:pPr>
+        <w:pStyle w:val="ListBullet"/>
+        <w:spacing w:after="60"/>
+      </w:pPr>
+      <w:r>
+        <w:rPr>
+          <w:sz w:val="22"/>
+        </w:rPr>
+        <w:t>delivery speed and output measured against the schedule;</w:t>
+      </w:r>
+    </w:p>
+    <w:p>
+      <w:pPr>
+        <w:pStyle w:val="ListBullet"/>
+        <w:spacing w:after="60"/>
+      </w:pPr>
+      <w:r>
+        <w:rPr>
+          <w:sz w:val="22"/>
+        </w:rPr>
+        <w:t>the quality of the deliverables produced;</w:t>
+      </w:r>
+    </w:p>
+    <w:p>
+      <w:pPr>
+        <w:pStyle w:val="ListBullet"/>
+        <w:spacing w:after="60"/>
+      </w:pPr>
+      <w:r>
+        <w:rPr>
+          <w:sz w:val="22"/>
+        </w:rPr>
+        <w:t>the working relationship and communication.</w:t>
+      </w:r>
+    </w:p>
+    <w:p>
+      <w:pPr>
+        <w:spacing w:after="120"/>
+      </w:pPr>
+      <w:r>
+        <w:rPr>
+          <w:b w:val="0"/>
+          <w:i w:val="0"/>
+          <w:color w:val="000000"/>
+          <w:sz w:val="22"/>
+        </w:rPr>
+        <w:t>If both parties are satisfied, the engagement continues into Weeks 3 to 8 to complete the build under the same terms. If either party decides not to continue, the engagement ends at the trial and only the two weeks worked are payable. This structure limits the client's initial commitment to two weeks and provides a clear, evidence-based decision point before the full budget is committed.</w:t>
+      </w:r>
+    </w:p>
+    <w:p>
+      <w:pPr>
+        <w:pStyle w:val="Heading1"/>
+      </w:pPr>
+      <w:r>
+        <w:t>9. Cost Summary</w:t>
       </w:r>
     </w:p>
     <w:tbl>
@@ -2561,7 +2725,7 @@
         <w:pStyle w:val="Heading1"/>
       </w:pPr>
       <w:r>
-        <w:t>9. Payment Schedule</w:t>
+        <w:t>10. Payment Schedule</w:t>
       </w:r>
     </w:p>
     <w:p>
@@ -3231,10 +3395,24 @@
     </w:p>
     <w:p>
       <w:pPr>
+        <w:spacing w:after="120"/>
+      </w:pPr>
+      <w:r>
+        <w:rPr>
+          <w:b w:val="0"/>
+          <w:i w:val="0"/>
+          <w:color w:val="555555"/>
+          <w:sz w:val="21"/>
+        </w:rPr>
+        <w:t>The client's initial financial commitment is limited to the two-week trial period ($10,000). Invoicing for Weeks 3 to 8 proceeds only if the engagement continues past the end-of-Week-2 review (see Section 8).</w:t>
+      </w:r>
+    </w:p>
+    <w:p>
+      <w:pPr>
         <w:pStyle w:val="Heading1"/>
       </w:pPr>
       <w:r>
-        <w:t>10. Decisions Required Before Work Begins</w:t>
+        <w:t>11. Decisions Required Before Work Begins</w:t>
       </w:r>
     </w:p>
     <w:p>
@@ -3316,7 +3494,7 @@
         <w:pStyle w:val="Heading1"/>
       </w:pPr>
       <w:r>
-        <w:t>11. Fast-Follows After Launch</w:t>
+        <w:t>12. Fast-Follows After Launch</w:t>
       </w:r>
     </w:p>
     <w:p>
@@ -3462,7 +3640,7 @@
         <w:pStyle w:val="Heading1"/>
       </w:pPr>
       <w:r>
-        <w:t>12. Assumptions</w:t>
+        <w:t>13. Assumptions</w:t>
       </w:r>
     </w:p>
     <w:p>
@@ -3542,7 +3720,7 @@
         <w:pStyle w:val="Heading1"/>
       </w:pPr>
       <w:r>
-        <w:t>13. Costs Not Included in This Quote</w:t>
+        <w:t>14. Costs Not Included in This Quote</w:t>
       </w:r>
     </w:p>
     <w:p>
@@ -3610,7 +3788,7 @@
         <w:pStyle w:val="Heading1"/>
       </w:pPr>
       <w:r>
-        <w:t>14. Next Steps</w:t>
+        <w:t>15. Next Steps</w:t>
       </w:r>
     </w:p>
     <w:p>
@@ -3622,7 +3800,7 @@
         <w:rPr>
           <w:sz w:val="22"/>
         </w:rPr>
-        <w:t>Confirm acceptance of this proposal and the 8-week fixed scope.</w:t>
+        <w:t>Confirm acceptance of this proposal, beginning with the two-week trial period.</w:t>
       </w:r>
     </w:p>
     <w:p>
@@ -3659,6 +3837,18 @@
           <w:sz w:val="22"/>
         </w:rPr>
         <w:t>Begin Week 1. A running build will be available on device within the first week.</w:t>
+      </w:r>
+    </w:p>
+    <w:p>
+      <w:pPr>
+        <w:pStyle w:val="ListNumber"/>
+        <w:spacing w:after="60"/>
+      </w:pPr>
+      <w:r>
+        <w:rPr>
+          <w:sz w:val="22"/>
+        </w:rPr>
+        <w:t>Review progress at the end of Week 2 and jointly decide whether to continue into Weeks 3 to 8.</w:t>
       </w:r>
     </w:p>
     <w:p/>

</xml_diff>

<commit_message>
Add trial success criteria table to Section 8
Concrete, indicative acceptance criteria for the end-of-Week-2 gate:
running iOS build, design system, onboarding, waitlist, compatibility
questionnaire, backend/accounts, and delivery pace.

Co-Authored-By: Claude Opus 4.8 <noreply@anthropic.com>
Claude-Session: https://claude.ai/code/session_011bUwMcRtgNUyipe9jLvq3o
</commit_message>
<xml_diff>
--- a/Gather_Proposal.docx
+++ b/Gather_Proposal.docx
@@ -2497,6 +2497,385 @@
     </w:p>
     <w:p>
       <w:pPr>
+        <w:spacing w:after="40"/>
+      </w:pPr>
+      <w:r>
+        <w:rPr>
+          <w:b/>
+          <w:i w:val="0"/>
+          <w:color w:val="000000"/>
+          <w:sz w:val="22"/>
+        </w:rPr>
+        <w:t>Trial success criteria.</w:t>
+      </w:r>
+    </w:p>
+    <w:p>
+      <w:pPr>
+        <w:spacing w:after="80"/>
+      </w:pPr>
+      <w:r>
+        <w:rPr>
+          <w:b w:val="0"/>
+          <w:i w:val="0"/>
+          <w:color w:val="000000"/>
+          <w:sz w:val="22"/>
+        </w:rPr>
+        <w:t>Success at the Week 2 review means the following are demonstrably working on a real device. These criteria are indicative and will be confirmed together at kickoff.</w:t>
+      </w:r>
+    </w:p>
+    <w:tbl>
+      <w:tblPr>
+        <w:tblStyle w:val="TableGrid"/>
+        <w:tblW w:type="auto" w:w="0"/>
+        <w:jc w:val="left"/>
+        <w:tblLook w:firstColumn="1" w:firstRow="1" w:lastColumn="0" w:lastRow="0" w:noHBand="0" w:noVBand="1" w:val="04A0"/>
+      </w:tblPr>
+      <w:tblGrid>
+        <w:gridCol w:w="4320"/>
+        <w:gridCol w:w="4320"/>
+      </w:tblGrid>
+      <w:tr>
+        <w:tc>
+          <w:tcPr>
+            <w:tcW w:type="dxa" w:w="3168"/>
+            <w:shd w:val="clear" w:color="auto" w:fill="D9D9D9"/>
+          </w:tcPr>
+          <w:p>
+            <w:pPr>
+              <w:spacing w:after="40" w:before="40"/>
+            </w:pPr>
+            <w:r/>
+            <w:r>
+              <w:rPr>
+                <w:rFonts w:ascii="Calibri" w:hAnsi="Calibri"/>
+                <w:b/>
+                <w:color w:val="000000"/>
+                <w:sz w:val="21"/>
+              </w:rPr>
+              <w:t>Area</w:t>
+            </w:r>
+          </w:p>
+        </w:tc>
+        <w:tc>
+          <w:tcPr>
+            <w:tcW w:type="dxa" w:w="6192"/>
+            <w:shd w:val="clear" w:color="auto" w:fill="D9D9D9"/>
+          </w:tcPr>
+          <w:p>
+            <w:pPr>
+              <w:spacing w:after="40" w:before="40"/>
+            </w:pPr>
+            <w:r/>
+            <w:r>
+              <w:rPr>
+                <w:rFonts w:ascii="Calibri" w:hAnsi="Calibri"/>
+                <w:b/>
+                <w:color w:val="000000"/>
+                <w:sz w:val="21"/>
+              </w:rPr>
+              <w:t>Working on device by the end of Week 2</w:t>
+            </w:r>
+          </w:p>
+        </w:tc>
+      </w:tr>
+      <w:tr>
+        <w:tc>
+          <w:tcPr>
+            <w:tcW w:type="dxa" w:w="3168"/>
+          </w:tcPr>
+          <w:p>
+            <w:pPr>
+              <w:spacing w:after="40" w:before="40"/>
+            </w:pPr>
+            <w:r/>
+            <w:r>
+              <w:rPr>
+                <w:rFonts w:ascii="Calibri" w:hAnsi="Calibri"/>
+                <w:b w:val="0"/>
+                <w:color w:val="000000"/>
+                <w:sz w:val="21"/>
+              </w:rPr>
+              <w:t>Running application</w:t>
+            </w:r>
+          </w:p>
+        </w:tc>
+        <w:tc>
+          <w:tcPr>
+            <w:tcW w:type="dxa" w:w="6192"/>
+          </w:tcPr>
+          <w:p>
+            <w:pPr>
+              <w:spacing w:after="40" w:before="40"/>
+            </w:pPr>
+            <w:r/>
+            <w:r>
+              <w:rPr>
+                <w:rFonts w:ascii="Calibri" w:hAnsi="Calibri"/>
+                <w:b w:val="0"/>
+                <w:color w:val="000000"/>
+                <w:sz w:val="21"/>
+              </w:rPr>
+              <w:t>Installable iOS build (TestFlight), refreshed at the end of each week</w:t>
+            </w:r>
+          </w:p>
+        </w:tc>
+      </w:tr>
+      <w:tr>
+        <w:tc>
+          <w:tcPr>
+            <w:tcW w:type="dxa" w:w="3168"/>
+          </w:tcPr>
+          <w:p>
+            <w:pPr>
+              <w:spacing w:after="40" w:before="40"/>
+            </w:pPr>
+            <w:r/>
+            <w:r>
+              <w:rPr>
+                <w:rFonts w:ascii="Calibri" w:hAnsi="Calibri"/>
+                <w:b w:val="0"/>
+                <w:color w:val="000000"/>
+                <w:sz w:val="21"/>
+              </w:rPr>
+              <w:t>Design system</w:t>
+            </w:r>
+          </w:p>
+        </w:tc>
+        <w:tc>
+          <w:tcPr>
+            <w:tcW w:type="dxa" w:w="6192"/>
+          </w:tcPr>
+          <w:p>
+            <w:pPr>
+              <w:spacing w:after="40" w:before="40"/>
+            </w:pPr>
+            <w:r/>
+            <w:r>
+              <w:rPr>
+                <w:rFonts w:ascii="Calibri" w:hAnsi="Calibri"/>
+                <w:b w:val="0"/>
+                <w:color w:val="000000"/>
+                <w:sz w:val="21"/>
+              </w:rPr>
+              <w:t>Core interface components and the four-tab navigation shell, matching the provided design</w:t>
+            </w:r>
+          </w:p>
+        </w:tc>
+      </w:tr>
+      <w:tr>
+        <w:tc>
+          <w:tcPr>
+            <w:tcW w:type="dxa" w:w="3168"/>
+          </w:tcPr>
+          <w:p>
+            <w:pPr>
+              <w:spacing w:after="40" w:before="40"/>
+            </w:pPr>
+            <w:r/>
+            <w:r>
+              <w:rPr>
+                <w:rFonts w:ascii="Calibri" w:hAnsi="Calibri"/>
+                <w:b w:val="0"/>
+                <w:color w:val="000000"/>
+                <w:sz w:val="21"/>
+              </w:rPr>
+              <w:t>Onboarding</w:t>
+            </w:r>
+          </w:p>
+        </w:tc>
+        <w:tc>
+          <w:tcPr>
+            <w:tcW w:type="dxa" w:w="6192"/>
+          </w:tcPr>
+          <w:p>
+            <w:pPr>
+              <w:spacing w:after="40" w:before="40"/>
+            </w:pPr>
+            <w:r/>
+            <w:r>
+              <w:rPr>
+                <w:rFonts w:ascii="Calibri" w:hAnsi="Calibri"/>
+                <w:b w:val="0"/>
+                <w:color w:val="000000"/>
+                <w:sz w:val="21"/>
+              </w:rPr>
+              <w:t>Welcome sequence, invitation-code entry, and city and email capture</w:t>
+            </w:r>
+          </w:p>
+        </w:tc>
+      </w:tr>
+      <w:tr>
+        <w:tc>
+          <w:tcPr>
+            <w:tcW w:type="dxa" w:w="3168"/>
+          </w:tcPr>
+          <w:p>
+            <w:pPr>
+              <w:spacing w:after="40" w:before="40"/>
+            </w:pPr>
+            <w:r/>
+            <w:r>
+              <w:rPr>
+                <w:rFonts w:ascii="Calibri" w:hAnsi="Calibri"/>
+                <w:b w:val="0"/>
+                <w:color w:val="000000"/>
+                <w:sz w:val="21"/>
+              </w:rPr>
+              <w:t>Waitlist</w:t>
+            </w:r>
+          </w:p>
+        </w:tc>
+        <w:tc>
+          <w:tcPr>
+            <w:tcW w:type="dxa" w:w="6192"/>
+          </w:tcPr>
+          <w:p>
+            <w:pPr>
+              <w:spacing w:after="40" w:before="40"/>
+            </w:pPr>
+            <w:r/>
+            <w:r>
+              <w:rPr>
+                <w:rFonts w:ascii="Calibri" w:hAnsi="Calibri"/>
+                <w:b w:val="0"/>
+                <w:color w:val="000000"/>
+                <w:sz w:val="21"/>
+              </w:rPr>
+              <w:t>Waitlist position displayed, with the group (cohort) structure in place</w:t>
+            </w:r>
+          </w:p>
+        </w:tc>
+      </w:tr>
+      <w:tr>
+        <w:tc>
+          <w:tcPr>
+            <w:tcW w:type="dxa" w:w="3168"/>
+          </w:tcPr>
+          <w:p>
+            <w:pPr>
+              <w:spacing w:after="40" w:before="40"/>
+            </w:pPr>
+            <w:r/>
+            <w:r>
+              <w:rPr>
+                <w:rFonts w:ascii="Calibri" w:hAnsi="Calibri"/>
+                <w:b w:val="0"/>
+                <w:color w:val="000000"/>
+                <w:sz w:val="21"/>
+              </w:rPr>
+              <w:t>Compatibility questionnaire</w:t>
+            </w:r>
+          </w:p>
+        </w:tc>
+        <w:tc>
+          <w:tcPr>
+            <w:tcW w:type="dxa" w:w="6192"/>
+          </w:tcPr>
+          <w:p>
+            <w:pPr>
+              <w:spacing w:after="40" w:before="40"/>
+            </w:pPr>
+            <w:r/>
+            <w:r>
+              <w:rPr>
+                <w:rFonts w:ascii="Calibri" w:hAnsi="Calibri"/>
+                <w:b w:val="0"/>
+                <w:color w:val="000000"/>
+                <w:sz w:val="21"/>
+              </w:rPr>
+              <w:t>Intent, availability and conversation style captured and stored</w:t>
+            </w:r>
+          </w:p>
+        </w:tc>
+      </w:tr>
+      <w:tr>
+        <w:tc>
+          <w:tcPr>
+            <w:tcW w:type="dxa" w:w="3168"/>
+          </w:tcPr>
+          <w:p>
+            <w:pPr>
+              <w:spacing w:after="40" w:before="40"/>
+            </w:pPr>
+            <w:r/>
+            <w:r>
+              <w:rPr>
+                <w:rFonts w:ascii="Calibri" w:hAnsi="Calibri"/>
+                <w:b w:val="0"/>
+                <w:color w:val="000000"/>
+                <w:sz w:val="21"/>
+              </w:rPr>
+              <w:t>Backend and accounts</w:t>
+            </w:r>
+          </w:p>
+        </w:tc>
+        <w:tc>
+          <w:tcPr>
+            <w:tcW w:type="dxa" w:w="6192"/>
+          </w:tcPr>
+          <w:p>
+            <w:pPr>
+              <w:spacing w:after="40" w:before="40"/>
+            </w:pPr>
+            <w:r/>
+            <w:r>
+              <w:rPr>
+                <w:rFonts w:ascii="Calibri" w:hAnsi="Calibri"/>
+                <w:b w:val="0"/>
+                <w:color w:val="000000"/>
+                <w:sz w:val="21"/>
+              </w:rPr>
+              <w:t>Supabase project, data model and member sign-in working</w:t>
+            </w:r>
+          </w:p>
+        </w:tc>
+      </w:tr>
+      <w:tr>
+        <w:tc>
+          <w:tcPr>
+            <w:tcW w:type="dxa" w:w="3168"/>
+          </w:tcPr>
+          <w:p>
+            <w:pPr>
+              <w:spacing w:after="40" w:before="40"/>
+            </w:pPr>
+            <w:r/>
+            <w:r>
+              <w:rPr>
+                <w:rFonts w:ascii="Calibri" w:hAnsi="Calibri"/>
+                <w:b w:val="0"/>
+                <w:color w:val="000000"/>
+                <w:sz w:val="21"/>
+              </w:rPr>
+              <w:t>Delivery pace</w:t>
+            </w:r>
+          </w:p>
+        </w:tc>
+        <w:tc>
+          <w:tcPr>
+            <w:tcW w:type="dxa" w:w="6192"/>
+          </w:tcPr>
+          <w:p>
+            <w:pPr>
+              <w:spacing w:after="40" w:before="40"/>
+            </w:pPr>
+            <w:r/>
+            <w:r>
+              <w:rPr>
+                <w:rFonts w:ascii="Calibri" w:hAnsi="Calibri"/>
+                <w:b w:val="0"/>
+                <w:color w:val="000000"/>
+                <w:sz w:val="21"/>
+              </w:rPr>
+              <w:t>Two weekly builds delivered on schedule, demonstrating sustainable speed</w:t>
+            </w:r>
+          </w:p>
+        </w:tc>
+      </w:tr>
+    </w:tbl>
+    <w:p/>
+    <w:p>
+      <w:pPr>
         <w:pStyle w:val="Heading1"/>
       </w:pPr>
       <w:r>

</xml_diff>

<commit_message>
Set day rate to $500/day and remove discount wording
Day rate $500/day, total $20,000, weekly invoices $2,500, trial
commitment $5,000. Remove all references to a discounted rate.

Co-Authored-By: Claude Opus 4.8 <noreply@anthropic.com>
Claude-Session: https://claude.ai/code/session_011bUwMcRtgNUyipe9jLvq3o
</commit_message>
<xml_diff>
--- a/Gather_Proposal.docx
+++ b/Gather_Proposal.docx
@@ -371,7 +371,7 @@
                 <w:color w:val="000000"/>
                 <w:sz w:val="21"/>
               </w:rPr>
-              <w:t>$1,000 per day (a discounted rate can be discussed if required)</w:t>
+              <w:t>$500 per day</w:t>
             </w:r>
           </w:p>
         </w:tc>
@@ -413,7 +413,7 @@
                 <w:color w:val="000000"/>
                 <w:sz w:val="21"/>
               </w:rPr>
-              <w:t>$40,000 (excluding GST and third-party costs)</w:t>
+              <w:t>$20,000 (excluding GST and third-party costs)</w:t>
             </w:r>
           </w:p>
         </w:tc>
@@ -467,7 +467,7 @@
           <w:color w:val="000000"/>
           <w:sz w:val="22"/>
         </w:rPr>
-        <w:t>The proposed engagement is an 8-week fixed-scope build at a day rate of $1,000 per day, for a total fixed price of $40,000. Approximately 2.5 of the 8 weeks are reserved for iterative refinement, testing and launch. If budget is a constraint, a discounted rate can be discussed.</w:t>
+        <w:t>The proposed engagement is an 8-week fixed-scope build at a day rate of $500 per day, for a total fixed price of $20,000. Approximately 2.5 of the 8 weeks are reserved for iterative refinement, testing and launch.</w:t>
       </w:r>
     </w:p>
     <w:p>
@@ -653,7 +653,7 @@
           <w:color w:val="555555"/>
           <w:sz w:val="21"/>
         </w:rPr>
-        <w:t>Both roles are covered by the project day rate of $1,000 per day. The team structure increases delivery capacity and provides review and continuity at no change to the fixed price quoted in this proposal.</w:t>
+        <w:t>Both roles are covered by the project day rate of $500 per day. The team structure increases delivery capacity and provides review and continuity at no change to the fixed price quoted in this proposal.</w:t>
       </w:r>
     </w:p>
     <w:p>
@@ -2996,7 +2996,7 @@
                 <w:color w:val="000000"/>
                 <w:sz w:val="21"/>
               </w:rPr>
-              <w:t>40 working days at $1,000 per day</w:t>
+              <w:t>40 working days at $500 per day</w:t>
             </w:r>
           </w:p>
         </w:tc>
@@ -3016,7 +3016,7 @@
                 <w:color w:val="000000"/>
                 <w:sz w:val="21"/>
               </w:rPr>
-              <w:t>$40,000</w:t>
+              <w:t>$20,000</w:t>
             </w:r>
           </w:p>
         </w:tc>
@@ -3078,7 +3078,7 @@
                 <w:color w:val="000000"/>
                 <w:sz w:val="21"/>
               </w:rPr>
-              <w:t>$40,000</w:t>
+              <w:t>$20,000</w:t>
             </w:r>
           </w:p>
         </w:tc>
@@ -3096,7 +3096,7 @@
           <w:color w:val="555555"/>
           <w:sz w:val="21"/>
         </w:rPr>
-        <w:t>The day rate is $1,000 per day. If budget is a constraint, a discounted rate can be discussed on request.</w:t>
+        <w:t>The day rate is $500 per day.</w:t>
       </w:r>
     </w:p>
     <w:p>
@@ -3118,7 +3118,7 @@
           <w:color w:val="000000"/>
           <w:sz w:val="22"/>
         </w:rPr>
-        <w:t>The engagement is invoiced weekly. Each weekly invoice is $5,000 (five working days at $1,000 per day), for eight weeks.</w:t>
+        <w:t>The engagement is invoiced weekly. Each weekly invoice is $2,500 (five working days at $500 per day), for eight weeks.</w:t>
       </w:r>
     </w:p>
     <w:tbl>
@@ -3255,7 +3255,7 @@
                 <w:color w:val="000000"/>
                 <w:sz w:val="21"/>
               </w:rPr>
-              <w:t>$5,000</w:t>
+              <w:t>$2,500</w:t>
             </w:r>
           </w:p>
         </w:tc>
@@ -3317,7 +3317,7 @@
                 <w:color w:val="000000"/>
                 <w:sz w:val="21"/>
               </w:rPr>
-              <w:t>$5,000</w:t>
+              <w:t>$2,500</w:t>
             </w:r>
           </w:p>
         </w:tc>
@@ -3379,7 +3379,7 @@
                 <w:color w:val="000000"/>
                 <w:sz w:val="21"/>
               </w:rPr>
-              <w:t>$5,000</w:t>
+              <w:t>$2,500</w:t>
             </w:r>
           </w:p>
         </w:tc>
@@ -3441,7 +3441,7 @@
                 <w:color w:val="000000"/>
                 <w:sz w:val="21"/>
               </w:rPr>
-              <w:t>$5,000</w:t>
+              <w:t>$2,500</w:t>
             </w:r>
           </w:p>
         </w:tc>
@@ -3503,7 +3503,7 @@
                 <w:color w:val="000000"/>
                 <w:sz w:val="21"/>
               </w:rPr>
-              <w:t>$5,000</w:t>
+              <w:t>$2,500</w:t>
             </w:r>
           </w:p>
         </w:tc>
@@ -3565,7 +3565,7 @@
                 <w:color w:val="000000"/>
                 <w:sz w:val="21"/>
               </w:rPr>
-              <w:t>$5,000</w:t>
+              <w:t>$2,500</w:t>
             </w:r>
           </w:p>
         </w:tc>
@@ -3627,7 +3627,7 @@
                 <w:color w:val="000000"/>
                 <w:sz w:val="21"/>
               </w:rPr>
-              <w:t>$5,000</w:t>
+              <w:t>$2,500</w:t>
             </w:r>
           </w:p>
         </w:tc>
@@ -3689,7 +3689,7 @@
                 <w:color w:val="000000"/>
                 <w:sz w:val="21"/>
               </w:rPr>
-              <w:t>$5,000</w:t>
+              <w:t>$2,500</w:t>
             </w:r>
           </w:p>
         </w:tc>
@@ -3751,7 +3751,7 @@
                 <w:color w:val="000000"/>
                 <w:sz w:val="21"/>
               </w:rPr>
-              <w:t>$40,000</w:t>
+              <w:t>$20,000</w:t>
             </w:r>
           </w:p>
         </w:tc>
@@ -3783,7 +3783,7 @@
           <w:color w:val="555555"/>
           <w:sz w:val="21"/>
         </w:rPr>
-        <w:t>The client's initial financial commitment is limited to the two-week trial period ($10,000). Invoicing for Weeks 3 to 8 proceeds only if the engagement continues past the end-of-Week-2 review (see Section 8).</w:t>
+        <w:t>The client's initial financial commitment is limited to the two-week trial period ($5,000). Invoicing for Weeks 3 to 8 proceeds only if the engagement continues past the end-of-Week-2 review (see Section 8).</w:t>
       </w:r>
     </w:p>
     <w:p>
@@ -4237,7 +4237,7 @@
           <w:color w:val="555555"/>
           <w:sz w:val="18"/>
         </w:rPr>
-        <w:t>Prepared by Gary Shannon  |  10 July 2026  |  Day rate $1,000 per day</w:t>
+        <w:t>Prepared by Gary Shannon  |  10 July 2026  |  Day rate $500 per day</w:t>
       </w:r>
     </w:p>
     <w:sectPr>

</xml_diff>

<commit_message>
Reprice to $600/day ($3,000/week), $24,000 total
Day rate $600/day shown as $3,000/week; total $24,000; weekly invoices
$3,000; trial commitment $6,000.

Co-Authored-By: Claude Opus 4.8 <noreply@anthropic.com>
Claude-Session: https://claude.ai/code/session_011bUwMcRtgNUyipe9jLvq3o
</commit_message>
<xml_diff>
--- a/Gather_Proposal.docx
+++ b/Gather_Proposal.docx
@@ -371,7 +371,7 @@
                 <w:color w:val="000000"/>
                 <w:sz w:val="21"/>
               </w:rPr>
-              <w:t>$500 per day</w:t>
+              <w:t>$600 per day (equivalent to $3,000 per week)</w:t>
             </w:r>
           </w:p>
         </w:tc>
@@ -413,7 +413,7 @@
                 <w:color w:val="000000"/>
                 <w:sz w:val="21"/>
               </w:rPr>
-              <w:t>$20,000 (excluding GST and third-party costs)</w:t>
+              <w:t>$24,000 (excluding GST and third-party costs)</w:t>
             </w:r>
           </w:p>
         </w:tc>
@@ -467,7 +467,7 @@
           <w:color w:val="000000"/>
           <w:sz w:val="22"/>
         </w:rPr>
-        <w:t>The proposed engagement is an 8-week fixed-scope build at a day rate of $500 per day, for a total fixed price of $20,000. Approximately 2.5 of the 8 weeks are reserved for iterative refinement, testing and launch.</w:t>
+        <w:t>The proposed engagement is an 8-week fixed-scope build at a day rate of $600 per day, for a total fixed price of $24,000. Approximately 2.5 of the 8 weeks are reserved for iterative refinement, testing and launch.</w:t>
       </w:r>
     </w:p>
     <w:p>
@@ -653,7 +653,7 @@
           <w:color w:val="555555"/>
           <w:sz w:val="21"/>
         </w:rPr>
-        <w:t>Both roles are covered by the project day rate of $500 per day. The team structure increases delivery capacity and provides review and continuity at no change to the fixed price quoted in this proposal.</w:t>
+        <w:t>Both roles are covered by the project day rate of $600 per day. The team structure increases delivery capacity and provides review and continuity at no change to the fixed price quoted in this proposal.</w:t>
       </w:r>
     </w:p>
     <w:p>
@@ -2996,7 +2996,7 @@
                 <w:color w:val="000000"/>
                 <w:sz w:val="21"/>
               </w:rPr>
-              <w:t>40 working days at $500 per day</w:t>
+              <w:t>40 working days at $600 per day</w:t>
             </w:r>
           </w:p>
         </w:tc>
@@ -3016,7 +3016,7 @@
                 <w:color w:val="000000"/>
                 <w:sz w:val="21"/>
               </w:rPr>
-              <w:t>$20,000</w:t>
+              <w:t>$24,000</w:t>
             </w:r>
           </w:p>
         </w:tc>
@@ -3078,7 +3078,7 @@
                 <w:color w:val="000000"/>
                 <w:sz w:val="21"/>
               </w:rPr>
-              <w:t>$20,000</w:t>
+              <w:t>$24,000</w:t>
             </w:r>
           </w:p>
         </w:tc>
@@ -3096,7 +3096,7 @@
           <w:color w:val="555555"/>
           <w:sz w:val="21"/>
         </w:rPr>
-        <w:t>The day rate is $500 per day.</w:t>
+        <w:t>The day rate is $600 per day.</w:t>
       </w:r>
     </w:p>
     <w:p>
@@ -3118,7 +3118,7 @@
           <w:color w:val="000000"/>
           <w:sz w:val="22"/>
         </w:rPr>
-        <w:t>The engagement is invoiced weekly. Each weekly invoice is $2,500 (five working days at $500 per day), for eight weeks.</w:t>
+        <w:t>The engagement is invoiced weekly. Each weekly invoice is $3,000 (five working days at $600 per day), for eight weeks.</w:t>
       </w:r>
     </w:p>
     <w:tbl>
@@ -3255,7 +3255,7 @@
                 <w:color w:val="000000"/>
                 <w:sz w:val="21"/>
               </w:rPr>
-              <w:t>$2,500</w:t>
+              <w:t>$3,000</w:t>
             </w:r>
           </w:p>
         </w:tc>
@@ -3317,7 +3317,7 @@
                 <w:color w:val="000000"/>
                 <w:sz w:val="21"/>
               </w:rPr>
-              <w:t>$2,500</w:t>
+              <w:t>$3,000</w:t>
             </w:r>
           </w:p>
         </w:tc>
@@ -3379,7 +3379,7 @@
                 <w:color w:val="000000"/>
                 <w:sz w:val="21"/>
               </w:rPr>
-              <w:t>$2,500</w:t>
+              <w:t>$3,000</w:t>
             </w:r>
           </w:p>
         </w:tc>
@@ -3441,7 +3441,7 @@
                 <w:color w:val="000000"/>
                 <w:sz w:val="21"/>
               </w:rPr>
-              <w:t>$2,500</w:t>
+              <w:t>$3,000</w:t>
             </w:r>
           </w:p>
         </w:tc>
@@ -3503,7 +3503,7 @@
                 <w:color w:val="000000"/>
                 <w:sz w:val="21"/>
               </w:rPr>
-              <w:t>$2,500</w:t>
+              <w:t>$3,000</w:t>
             </w:r>
           </w:p>
         </w:tc>
@@ -3565,7 +3565,7 @@
                 <w:color w:val="000000"/>
                 <w:sz w:val="21"/>
               </w:rPr>
-              <w:t>$2,500</w:t>
+              <w:t>$3,000</w:t>
             </w:r>
           </w:p>
         </w:tc>
@@ -3627,7 +3627,7 @@
                 <w:color w:val="000000"/>
                 <w:sz w:val="21"/>
               </w:rPr>
-              <w:t>$2,500</w:t>
+              <w:t>$3,000</w:t>
             </w:r>
           </w:p>
         </w:tc>
@@ -3689,7 +3689,7 @@
                 <w:color w:val="000000"/>
                 <w:sz w:val="21"/>
               </w:rPr>
-              <w:t>$2,500</w:t>
+              <w:t>$3,000</w:t>
             </w:r>
           </w:p>
         </w:tc>
@@ -3751,7 +3751,7 @@
                 <w:color w:val="000000"/>
                 <w:sz w:val="21"/>
               </w:rPr>
-              <w:t>$20,000</w:t>
+              <w:t>$24,000</w:t>
             </w:r>
           </w:p>
         </w:tc>
@@ -3783,7 +3783,7 @@
           <w:color w:val="555555"/>
           <w:sz w:val="21"/>
         </w:rPr>
-        <w:t>The client's initial financial commitment is limited to the two-week trial period ($5,000). Invoicing for Weeks 3 to 8 proceeds only if the engagement continues past the end-of-Week-2 review (see Section 8).</w:t>
+        <w:t>The client's initial financial commitment is limited to the two-week trial period ($6,000). Invoicing for Weeks 3 to 8 proceeds only if the engagement continues past the end-of-Week-2 review (see Section 8).</w:t>
       </w:r>
     </w:p>
     <w:p>
@@ -4237,7 +4237,7 @@
           <w:color w:val="555555"/>
           <w:sz w:val="18"/>
         </w:rPr>
-        <w:t>Prepared by Gary Shannon  |  10 July 2026  |  Day rate $500 per day</w:t>
+        <w:t>Prepared by Gary Shannon  |  10 July 2026  |  Day rate $600 per day</w:t>
       </w:r>
     </w:p>
     <w:sectPr>

</xml_diff>